<commit_message>
Inicio tabla de amortizacion
</commit_message>
<xml_diff>
--- a/financiera/templates_docx/RECIBO_DE_DESEMBOLSO.docx
+++ b/financiera/templates_docx/RECIBO_DE_DESEMBOLSO.docx
@@ -132,19 +132,39 @@
         </w:rPr>
       </w:pPr>
     </w:p>
-    <w:p>
-      <w:pPr>
-        <w:rPr>
-          <w:lang w:val="es-ES"/>
-        </w:rPr>
-      </w:pPr>
-      <w:r>
-        <w:rPr>
-          <w:lang w:val="es-ES"/>
-        </w:rPr>
-        <w:t>FIRMA______________________________________ HUELLA_________________</w:t>
-      </w:r>
-    </w:p>
+    <w:tbl>
+      <w:tblPr>
+        <w:tblW w:type="auto" w:w="0"/>
+        <w:tblLayout w:type="fixed"/>
+        <w:tblLook w:firstColumn="1" w:firstRow="1" w:lastColumn="0" w:lastRow="0" w:noHBand="0" w:noVBand="1" w:val="04A0"/>
+      </w:tblPr>
+      <w:tblGrid>
+        <w:gridCol w:w="5584"/>
+        <w:gridCol w:w="2920"/>
+      </w:tblGrid>
+      <w:tr>
+        <w:tc>
+          <w:tcPr>
+            <w:tcW w:type="dxa" w:w="5584"/>
+          </w:tcPr>
+          <w:p>
+            <w:r>
+              <w:t>FIRMA______________________________________</w:t>
+            </w:r>
+          </w:p>
+        </w:tc>
+        <w:tc>
+          <w:tcPr>
+            <w:tcW w:type="dxa" w:w="2920"/>
+          </w:tcPr>
+          <w:p>
+            <w:r>
+              <w:t>HUELLA_________________</w:t>
+            </w:r>
+          </w:p>
+        </w:tc>
+      </w:tr>
+    </w:tbl>
     <w:p>
       <w:pPr>
         <w:jc w:val="center"/>

</xml_diff>